<commit_message>
docs: revise the target-state reference architecture
From a parallel session, pushed at the owner's direction. The generator
drops the graphviz cluster definitions in favour of paragraph-level
styling, and the document is regenerated from it.

Checked rather than assumed before publishing to a public repository: the
generator compiles, the .docx is a complete Office package rather than a
mid-save truncation — 59 parts, valid zip, document.xml closes cleanly at
290,572 bytes — and neither carries credentials or client identifiers, with
all 59 decompressed parts scanned rather than just the archive's surface.
</commit_message>
<xml_diff>
--- a/docs/agentic-pdlc-target-state-reference-architecture.docx
+++ b/docs/agentic-pdlc-target-state-reference-architecture.docx
@@ -3829,7 +3829,7 @@
       <w:r>
         <w:drawing>
           <wp:inline xmlns:a="http://schemas.openxmlformats.org/drawingml/2006/main" xmlns:pic="http://schemas.openxmlformats.org/drawingml/2006/picture">
-            <wp:extent cx="8796528" cy="651937"/>
+            <wp:extent cx="8796528" cy="1306932"/>
             <wp:docPr id="2" name="Picture 2" descr="Architecture diagram: Enterprise context and evidence fabric. Authoritative enterprise records are normalized into immutable assertions and materialized into purpose-specific context projections."/>
             <wp:cNvGraphicFramePr>
               <a:graphicFrameLocks noChangeAspect="1"/>
@@ -3850,7 +3850,7 @@
                   <pic:spPr>
                     <a:xfrm>
                       <a:off x="0" y="0"/>
-                      <a:ext cx="8796528" cy="651937"/>
+                      <a:ext cx="8796528" cy="1306932"/>
                     </a:xfrm>
                     <a:prstGeom prst="rect"/>
                   </pic:spPr>
@@ -4954,7 +4954,7 @@
       <w:r>
         <w:drawing>
           <wp:inline xmlns:a="http://schemas.openxmlformats.org/drawingml/2006/main" xmlns:pic="http://schemas.openxmlformats.org/drawingml/2006/picture">
-            <wp:extent cx="8796528" cy="650700"/>
+            <wp:extent cx="8796528" cy="1059496"/>
             <wp:docPr id="3" name="Picture 3" descr="Architecture diagram: Temporal identity, assertion and snapshot model. Stable entities are separated from immutable revisions and execution attempts; bitemporal assertions produce reproducible views."/>
             <wp:cNvGraphicFramePr>
               <a:graphicFrameLocks noChangeAspect="1"/>
@@ -4975,7 +4975,7 @@
                   <pic:spPr>
                     <a:xfrm>
                       <a:off x="0" y="0"/>
-                      <a:ext cx="8796528" cy="650700"/>
+                      <a:ext cx="8796528" cy="1059496"/>
                     </a:xfrm>
                     <a:prstGeom prst="rect"/>
                   </pic:spPr>
@@ -5756,7 +5756,7 @@
       <w:r>
         <w:drawing>
           <wp:inline xmlns:a="http://schemas.openxmlformats.org/drawingml/2006/main" xmlns:pic="http://schemas.openxmlformats.org/drawingml/2006/picture">
-            <wp:extent cx="8796528" cy="904241"/>
+            <wp:extent cx="8796528" cy="889566"/>
             <wp:docPr id="4" name="Picture 4" descr="Architecture diagram: Multi-signal canonical Impact Engine. A revision pair is semantically analyzed, expanded across typed relationship signals and converted into explained impact tiers."/>
             <wp:cNvGraphicFramePr>
               <a:graphicFrameLocks noChangeAspect="1"/>
@@ -5777,7 +5777,7 @@
                   <pic:spPr>
                     <a:xfrm>
                       <a:off x="0" y="0"/>
-                      <a:ext cx="8796528" cy="904241"/>
+                      <a:ext cx="8796528" cy="889566"/>
                     </a:xfrm>
                     <a:prstGeom prst="rect"/>
                   </pic:spPr>
@@ -6817,7 +6817,7 @@
       <w:r>
         <w:drawing>
           <wp:inline xmlns:a="http://schemas.openxmlformats.org/drawingml/2006/main" xmlns:pic="http://schemas.openxmlformats.org/drawingml/2006/picture">
-            <wp:extent cx="8796528" cy="994032"/>
+            <wp:extent cx="8796528" cy="1150279"/>
             <wp:docPr id="5" name="Picture 5" descr="Architecture diagram: Risk-based quality, test data and evidence architecture. Impact-derived obligations drive test planning, scenario-scoped data leases, isolated execution and an immutable evidence bundle."/>
             <wp:cNvGraphicFramePr>
               <a:graphicFrameLocks noChangeAspect="1"/>
@@ -6838,7 +6838,7 @@
                   <pic:spPr>
                     <a:xfrm>
                       <a:off x="0" y="0"/>
-                      <a:ext cx="8796528" cy="994032"/>
+                      <a:ext cx="8796528" cy="1150279"/>
                     </a:xfrm>
                     <a:prstGeom prst="rect"/>
                   </pic:spPr>
@@ -8495,7 +8495,7 @@
       <w:r>
         <w:drawing>
           <wp:inline xmlns:a="http://schemas.openxmlformats.org/drawingml/2006/main" xmlns:pic="http://schemas.openxmlformats.org/drawingml/2006/picture">
-            <wp:extent cx="8796528" cy="946750"/>
+            <wp:extent cx="8796528" cy="1884835"/>
             <wp:docPr id="7" name="Picture 7" descr="Architecture diagram: Hybrid deployment and zero-trust execution. A governed control plane dispatches signed work into a client-controlled execution plane using short-lived identity and policy-filtered context."/>
             <wp:cNvGraphicFramePr>
               <a:graphicFrameLocks noChangeAspect="1"/>
@@ -8516,7 +8516,7 @@
                   <pic:spPr>
                     <a:xfrm>
                       <a:off x="0" y="0"/>
-                      <a:ext cx="8796528" cy="946750"/>
+                      <a:ext cx="8796528" cy="1884835"/>
                     </a:xfrm>
                     <a:prstGeom prst="rect"/>
                   </pic:spPr>
@@ -9551,7 +9551,7 @@
       <w:r>
         <w:drawing>
           <wp:inline xmlns:a="http://schemas.openxmlformats.org/drawingml/2006/main" xmlns:pic="http://schemas.openxmlformats.org/drawingml/2006/picture">
-            <wp:extent cx="8796528" cy="802817"/>
+            <wp:extent cx="8796528" cy="2683648"/>
             <wp:docPr id="8" name="Picture 8" descr="Architecture diagram: Governed closed-loop learning. Observed delivery outcomes become labeled evaluation cases; only measured, approved and signed improvements reach runtime."/>
             <wp:cNvGraphicFramePr>
               <a:graphicFrameLocks noChangeAspect="1"/>
@@ -9572,7 +9572,7 @@
                   <pic:spPr>
                     <a:xfrm>
                       <a:off x="0" y="0"/>
-                      <a:ext cx="8796528" cy="802817"/>
+                      <a:ext cx="8796528" cy="2683648"/>
                     </a:xfrm>
                     <a:prstGeom prst="rect"/>
                   </pic:spPr>
@@ -14738,11 +14738,11 @@
 <w:ftr xmlns:m="http://schemas.openxmlformats.org/officeDocument/2006/math" xmlns:mc="http://schemas.openxmlformats.org/markup-compatibility/2006" xmlns:mo="http://schemas.microsoft.com/office/mac/office/2008/main" xmlns:mv="urn:schemas-microsoft-com:mac:vml" xmlns:o="urn:schemas-microsoft-com:office:office" xmlns:r="http://schemas.openxmlformats.org/officeDocument/2006/relationships" xmlns:v="urn:schemas-microsoft-com:vml" xmlns:w10="urn:schemas-microsoft-com:office:word" xmlns:w14="http://schemas.microsoft.com/office/word/2010/wordml" xmlns:w="http://schemas.openxmlformats.org/wordprocessingml/2006/main" xmlns:wne="http://schemas.microsoft.com/office/word/2006/wordml" xmlns:wp14="http://schemas.microsoft.com/office/word/2010/wordprocessingDrawing" xmlns:wp="http://schemas.openxmlformats.org/drawingml/2006/wordprocessingDrawing" xmlns:wpc="http://schemas.microsoft.com/office/word/2010/wordprocessingCanvas" xmlns:wpg="http://schemas.microsoft.com/office/word/2010/wordprocessingGroup" xmlns:wpi="http://schemas.microsoft.com/office/word/2010/wordprocessingInk" xmlns:wps="http://schemas.microsoft.com/office/word/2010/wordprocessingShape" mc:Ignorable="w14 wp14">
   <w:p>
     <w:pPr>
-      <w:pStyle w:val="Footer"/>
       <w:tabs>
         <w:tab w:pos="9360" w:val="right"/>
       </w:tabs>
       <w:spacing w:before="60"/>
+      <w:jc w:val="left"/>
     </w:pPr>
     <w:r/>
     <w:r>
@@ -14784,11 +14784,11 @@
 <w:ftr xmlns:m="http://schemas.openxmlformats.org/officeDocument/2006/math" xmlns:mc="http://schemas.openxmlformats.org/markup-compatibility/2006" xmlns:mo="http://schemas.microsoft.com/office/mac/office/2008/main" xmlns:mv="urn:schemas-microsoft-com:mac:vml" xmlns:o="urn:schemas-microsoft-com:office:office" xmlns:r="http://schemas.openxmlformats.org/officeDocument/2006/relationships" xmlns:v="urn:schemas-microsoft-com:vml" xmlns:w10="urn:schemas-microsoft-com:office:word" xmlns:w14="http://schemas.microsoft.com/office/word/2010/wordml" xmlns:w="http://schemas.openxmlformats.org/wordprocessingml/2006/main" xmlns:wne="http://schemas.microsoft.com/office/word/2006/wordml" xmlns:wp14="http://schemas.microsoft.com/office/word/2010/wordprocessingDrawing" xmlns:wp="http://schemas.openxmlformats.org/drawingml/2006/wordprocessingDrawing" xmlns:wpc="http://schemas.microsoft.com/office/word/2010/wordprocessingCanvas" xmlns:wpg="http://schemas.microsoft.com/office/word/2010/wordprocessingGroup" xmlns:wpi="http://schemas.microsoft.com/office/word/2010/wordprocessingInk" xmlns:wps="http://schemas.microsoft.com/office/word/2010/wordprocessingShape" mc:Ignorable="w14 wp14">
   <w:p>
     <w:pPr>
-      <w:pStyle w:val="Footer"/>
       <w:tabs>
         <w:tab w:pos="13968" w:val="right"/>
       </w:tabs>
       <w:spacing w:before="60"/>
+      <w:jc w:val="left"/>
     </w:pPr>
     <w:r/>
     <w:r>
@@ -14830,11 +14830,11 @@
 <w:ftr xmlns:m="http://schemas.openxmlformats.org/officeDocument/2006/math" xmlns:mc="http://schemas.openxmlformats.org/markup-compatibility/2006" xmlns:mo="http://schemas.microsoft.com/office/mac/office/2008/main" xmlns:mv="urn:schemas-microsoft-com:mac:vml" xmlns:o="urn:schemas-microsoft-com:office:office" xmlns:r="http://schemas.openxmlformats.org/officeDocument/2006/relationships" xmlns:v="urn:schemas-microsoft-com:vml" xmlns:w10="urn:schemas-microsoft-com:office:word" xmlns:w14="http://schemas.microsoft.com/office/word/2010/wordml" xmlns:w="http://schemas.openxmlformats.org/wordprocessingml/2006/main" xmlns:wne="http://schemas.microsoft.com/office/word/2006/wordml" xmlns:wp14="http://schemas.microsoft.com/office/word/2010/wordprocessingDrawing" xmlns:wp="http://schemas.openxmlformats.org/drawingml/2006/wordprocessingDrawing" xmlns:wpc="http://schemas.microsoft.com/office/word/2010/wordprocessingCanvas" xmlns:wpg="http://schemas.microsoft.com/office/word/2010/wordprocessingGroup" xmlns:wpi="http://schemas.microsoft.com/office/word/2010/wordprocessingInk" xmlns:wps="http://schemas.microsoft.com/office/word/2010/wordprocessingShape" mc:Ignorable="w14 wp14">
   <w:p>
     <w:pPr>
-      <w:pStyle w:val="Footer"/>
       <w:tabs>
         <w:tab w:pos="9360" w:val="right"/>
       </w:tabs>
       <w:spacing w:before="60"/>
+      <w:jc w:val="left"/>
     </w:pPr>
     <w:r/>
     <w:r>
@@ -14876,11 +14876,11 @@
 <w:ftr xmlns:m="http://schemas.openxmlformats.org/officeDocument/2006/math" xmlns:mc="http://schemas.openxmlformats.org/markup-compatibility/2006" xmlns:mo="http://schemas.microsoft.com/office/mac/office/2008/main" xmlns:mv="urn:schemas-microsoft-com:mac:vml" xmlns:o="urn:schemas-microsoft-com:office:office" xmlns:r="http://schemas.openxmlformats.org/officeDocument/2006/relationships" xmlns:v="urn:schemas-microsoft-com:vml" xmlns:w10="urn:schemas-microsoft-com:office:word" xmlns:w14="http://schemas.microsoft.com/office/word/2010/wordml" xmlns:w="http://schemas.openxmlformats.org/wordprocessingml/2006/main" xmlns:wne="http://schemas.microsoft.com/office/word/2006/wordml" xmlns:wp14="http://schemas.microsoft.com/office/word/2010/wordprocessingDrawing" xmlns:wp="http://schemas.openxmlformats.org/drawingml/2006/wordprocessingDrawing" xmlns:wpc="http://schemas.microsoft.com/office/word/2010/wordprocessingCanvas" xmlns:wpg="http://schemas.microsoft.com/office/word/2010/wordprocessingGroup" xmlns:wpi="http://schemas.microsoft.com/office/word/2010/wordprocessingInk" xmlns:wps="http://schemas.microsoft.com/office/word/2010/wordprocessingShape" mc:Ignorable="w14 wp14">
   <w:p>
     <w:pPr>
-      <w:pStyle w:val="Footer"/>
       <w:tabs>
         <w:tab w:pos="13968" w:val="right"/>
       </w:tabs>
       <w:spacing w:before="60"/>
+      <w:jc w:val="left"/>
     </w:pPr>
     <w:r/>
     <w:r>
@@ -14922,11 +14922,11 @@
 <w:ftr xmlns:m="http://schemas.openxmlformats.org/officeDocument/2006/math" xmlns:mc="http://schemas.openxmlformats.org/markup-compatibility/2006" xmlns:mo="http://schemas.microsoft.com/office/mac/office/2008/main" xmlns:mv="urn:schemas-microsoft-com:mac:vml" xmlns:o="urn:schemas-microsoft-com:office:office" xmlns:r="http://schemas.openxmlformats.org/officeDocument/2006/relationships" xmlns:v="urn:schemas-microsoft-com:vml" xmlns:w10="urn:schemas-microsoft-com:office:word" xmlns:w14="http://schemas.microsoft.com/office/word/2010/wordml" xmlns:w="http://schemas.openxmlformats.org/wordprocessingml/2006/main" xmlns:wne="http://schemas.microsoft.com/office/word/2006/wordml" xmlns:wp14="http://schemas.microsoft.com/office/word/2010/wordprocessingDrawing" xmlns:wp="http://schemas.openxmlformats.org/drawingml/2006/wordprocessingDrawing" xmlns:wpc="http://schemas.microsoft.com/office/word/2010/wordprocessingCanvas" xmlns:wpg="http://schemas.microsoft.com/office/word/2010/wordprocessingGroup" xmlns:wpi="http://schemas.microsoft.com/office/word/2010/wordprocessingInk" xmlns:wps="http://schemas.microsoft.com/office/word/2010/wordprocessingShape" mc:Ignorable="w14 wp14">
   <w:p>
     <w:pPr>
-      <w:pStyle w:val="Footer"/>
       <w:tabs>
         <w:tab w:pos="9360" w:val="right"/>
       </w:tabs>
       <w:spacing w:before="60"/>
+      <w:jc w:val="left"/>
     </w:pPr>
     <w:r/>
     <w:r>
@@ -14968,11 +14968,11 @@
 <w:ftr xmlns:m="http://schemas.openxmlformats.org/officeDocument/2006/math" xmlns:mc="http://schemas.openxmlformats.org/markup-compatibility/2006" xmlns:mo="http://schemas.microsoft.com/office/mac/office/2008/main" xmlns:mv="urn:schemas-microsoft-com:mac:vml" xmlns:o="urn:schemas-microsoft-com:office:office" xmlns:r="http://schemas.openxmlformats.org/officeDocument/2006/relationships" xmlns:v="urn:schemas-microsoft-com:vml" xmlns:w10="urn:schemas-microsoft-com:office:word" xmlns:w14="http://schemas.microsoft.com/office/word/2010/wordml" xmlns:w="http://schemas.openxmlformats.org/wordprocessingml/2006/main" xmlns:wne="http://schemas.microsoft.com/office/word/2006/wordml" xmlns:wp14="http://schemas.microsoft.com/office/word/2010/wordprocessingDrawing" xmlns:wp="http://schemas.openxmlformats.org/drawingml/2006/wordprocessingDrawing" xmlns:wpc="http://schemas.microsoft.com/office/word/2010/wordprocessingCanvas" xmlns:wpg="http://schemas.microsoft.com/office/word/2010/wordprocessingGroup" xmlns:wpi="http://schemas.microsoft.com/office/word/2010/wordprocessingInk" xmlns:wps="http://schemas.microsoft.com/office/word/2010/wordprocessingShape" mc:Ignorable="w14 wp14">
   <w:p>
     <w:pPr>
-      <w:pStyle w:val="Footer"/>
       <w:tabs>
         <w:tab w:pos="13968" w:val="right"/>
       </w:tabs>
       <w:spacing w:before="60"/>
+      <w:jc w:val="left"/>
     </w:pPr>
     <w:r/>
     <w:r>
@@ -15014,11 +15014,11 @@
 <w:ftr xmlns:m="http://schemas.openxmlformats.org/officeDocument/2006/math" xmlns:mc="http://schemas.openxmlformats.org/markup-compatibility/2006" xmlns:mo="http://schemas.microsoft.com/office/mac/office/2008/main" xmlns:mv="urn:schemas-microsoft-com:mac:vml" xmlns:o="urn:schemas-microsoft-com:office:office" xmlns:r="http://schemas.openxmlformats.org/officeDocument/2006/relationships" xmlns:v="urn:schemas-microsoft-com:vml" xmlns:w10="urn:schemas-microsoft-com:office:word" xmlns:w14="http://schemas.microsoft.com/office/word/2010/wordml" xmlns:w="http://schemas.openxmlformats.org/wordprocessingml/2006/main" xmlns:wne="http://schemas.microsoft.com/office/word/2006/wordml" xmlns:wp14="http://schemas.microsoft.com/office/word/2010/wordprocessingDrawing" xmlns:wp="http://schemas.openxmlformats.org/drawingml/2006/wordprocessingDrawing" xmlns:wpc="http://schemas.microsoft.com/office/word/2010/wordprocessingCanvas" xmlns:wpg="http://schemas.microsoft.com/office/word/2010/wordprocessingGroup" xmlns:wpi="http://schemas.microsoft.com/office/word/2010/wordprocessingInk" xmlns:wps="http://schemas.microsoft.com/office/word/2010/wordprocessingShape" mc:Ignorable="w14 wp14">
   <w:p>
     <w:pPr>
-      <w:pStyle w:val="Footer"/>
       <w:tabs>
         <w:tab w:pos="9360" w:val="right"/>
       </w:tabs>
       <w:spacing w:before="60"/>
+      <w:jc w:val="left"/>
     </w:pPr>
     <w:r/>
     <w:r>
@@ -15060,11 +15060,11 @@
 <w:ftr xmlns:m="http://schemas.openxmlformats.org/officeDocument/2006/math" xmlns:mc="http://schemas.openxmlformats.org/markup-compatibility/2006" xmlns:mo="http://schemas.microsoft.com/office/mac/office/2008/main" xmlns:mv="urn:schemas-microsoft-com:mac:vml" xmlns:o="urn:schemas-microsoft-com:office:office" xmlns:r="http://schemas.openxmlformats.org/officeDocument/2006/relationships" xmlns:v="urn:schemas-microsoft-com:vml" xmlns:w10="urn:schemas-microsoft-com:office:word" xmlns:w14="http://schemas.microsoft.com/office/word/2010/wordml" xmlns:w="http://schemas.openxmlformats.org/wordprocessingml/2006/main" xmlns:wne="http://schemas.microsoft.com/office/word/2006/wordml" xmlns:wp14="http://schemas.microsoft.com/office/word/2010/wordprocessingDrawing" xmlns:wp="http://schemas.openxmlformats.org/drawingml/2006/wordprocessingDrawing" xmlns:wpc="http://schemas.microsoft.com/office/word/2010/wordprocessingCanvas" xmlns:wpg="http://schemas.microsoft.com/office/word/2010/wordprocessingGroup" xmlns:wpi="http://schemas.microsoft.com/office/word/2010/wordprocessingInk" xmlns:wps="http://schemas.microsoft.com/office/word/2010/wordprocessingShape" mc:Ignorable="w14 wp14">
   <w:p>
     <w:pPr>
-      <w:pStyle w:val="Footer"/>
       <w:tabs>
         <w:tab w:pos="13968" w:val="right"/>
       </w:tabs>
       <w:spacing w:before="60"/>
+      <w:jc w:val="left"/>
     </w:pPr>
     <w:r/>
     <w:r>
@@ -15106,11 +15106,11 @@
 <w:ftr xmlns:m="http://schemas.openxmlformats.org/officeDocument/2006/math" xmlns:mc="http://schemas.openxmlformats.org/markup-compatibility/2006" xmlns:mo="http://schemas.microsoft.com/office/mac/office/2008/main" xmlns:mv="urn:schemas-microsoft-com:mac:vml" xmlns:o="urn:schemas-microsoft-com:office:office" xmlns:r="http://schemas.openxmlformats.org/officeDocument/2006/relationships" xmlns:v="urn:schemas-microsoft-com:vml" xmlns:w10="urn:schemas-microsoft-com:office:word" xmlns:w14="http://schemas.microsoft.com/office/word/2010/wordml" xmlns:w="http://schemas.openxmlformats.org/wordprocessingml/2006/main" xmlns:wne="http://schemas.microsoft.com/office/word/2006/wordml" xmlns:wp14="http://schemas.microsoft.com/office/word/2010/wordprocessingDrawing" xmlns:wp="http://schemas.openxmlformats.org/drawingml/2006/wordprocessingDrawing" xmlns:wpc="http://schemas.microsoft.com/office/word/2010/wordprocessingCanvas" xmlns:wpg="http://schemas.microsoft.com/office/word/2010/wordprocessingGroup" xmlns:wpi="http://schemas.microsoft.com/office/word/2010/wordprocessingInk" xmlns:wps="http://schemas.microsoft.com/office/word/2010/wordprocessingShape" mc:Ignorable="w14 wp14">
   <w:p>
     <w:pPr>
-      <w:pStyle w:val="Footer"/>
       <w:tabs>
         <w:tab w:pos="9360" w:val="right"/>
       </w:tabs>
       <w:spacing w:before="60"/>
+      <w:jc w:val="left"/>
     </w:pPr>
     <w:r/>
     <w:r>
@@ -15152,11 +15152,11 @@
 <w:ftr xmlns:m="http://schemas.openxmlformats.org/officeDocument/2006/math" xmlns:mc="http://schemas.openxmlformats.org/markup-compatibility/2006" xmlns:mo="http://schemas.microsoft.com/office/mac/office/2008/main" xmlns:mv="urn:schemas-microsoft-com:mac:vml" xmlns:o="urn:schemas-microsoft-com:office:office" xmlns:r="http://schemas.openxmlformats.org/officeDocument/2006/relationships" xmlns:v="urn:schemas-microsoft-com:vml" xmlns:w10="urn:schemas-microsoft-com:office:word" xmlns:w14="http://schemas.microsoft.com/office/word/2010/wordml" xmlns:w="http://schemas.openxmlformats.org/wordprocessingml/2006/main" xmlns:wne="http://schemas.microsoft.com/office/word/2006/wordml" xmlns:wp14="http://schemas.microsoft.com/office/word/2010/wordprocessingDrawing" xmlns:wp="http://schemas.openxmlformats.org/drawingml/2006/wordprocessingDrawing" xmlns:wpc="http://schemas.microsoft.com/office/word/2010/wordprocessingCanvas" xmlns:wpg="http://schemas.microsoft.com/office/word/2010/wordprocessingGroup" xmlns:wpi="http://schemas.microsoft.com/office/word/2010/wordprocessingInk" xmlns:wps="http://schemas.microsoft.com/office/word/2010/wordprocessingShape" mc:Ignorable="w14 wp14">
   <w:p>
     <w:pPr>
-      <w:pStyle w:val="Footer"/>
       <w:tabs>
         <w:tab w:pos="13968" w:val="right"/>
       </w:tabs>
       <w:spacing w:before="60"/>
+      <w:jc w:val="left"/>
     </w:pPr>
     <w:r/>
     <w:r>
@@ -15198,11 +15198,11 @@
 <w:ftr xmlns:m="http://schemas.openxmlformats.org/officeDocument/2006/math" xmlns:mc="http://schemas.openxmlformats.org/markup-compatibility/2006" xmlns:mo="http://schemas.microsoft.com/office/mac/office/2008/main" xmlns:mv="urn:schemas-microsoft-com:mac:vml" xmlns:o="urn:schemas-microsoft-com:office:office" xmlns:r="http://schemas.openxmlformats.org/officeDocument/2006/relationships" xmlns:v="urn:schemas-microsoft-com:vml" xmlns:w10="urn:schemas-microsoft-com:office:word" xmlns:w14="http://schemas.microsoft.com/office/word/2010/wordml" xmlns:w="http://schemas.openxmlformats.org/wordprocessingml/2006/main" xmlns:wne="http://schemas.microsoft.com/office/word/2006/wordml" xmlns:wp14="http://schemas.microsoft.com/office/word/2010/wordprocessingDrawing" xmlns:wp="http://schemas.openxmlformats.org/drawingml/2006/wordprocessingDrawing" xmlns:wpc="http://schemas.microsoft.com/office/word/2010/wordprocessingCanvas" xmlns:wpg="http://schemas.microsoft.com/office/word/2010/wordprocessingGroup" xmlns:wpi="http://schemas.microsoft.com/office/word/2010/wordprocessingInk" xmlns:wps="http://schemas.microsoft.com/office/word/2010/wordprocessingShape" mc:Ignorable="w14 wp14">
   <w:p>
     <w:pPr>
-      <w:pStyle w:val="Footer"/>
       <w:tabs>
         <w:tab w:pos="9360" w:val="right"/>
       </w:tabs>
       <w:spacing w:before="60"/>
+      <w:jc w:val="left"/>
     </w:pPr>
     <w:r/>
     <w:r>
@@ -15244,11 +15244,11 @@
 <w:ftr xmlns:m="http://schemas.openxmlformats.org/officeDocument/2006/math" xmlns:mc="http://schemas.openxmlformats.org/markup-compatibility/2006" xmlns:mo="http://schemas.microsoft.com/office/mac/office/2008/main" xmlns:mv="urn:schemas-microsoft-com:mac:vml" xmlns:o="urn:schemas-microsoft-com:office:office" xmlns:r="http://schemas.openxmlformats.org/officeDocument/2006/relationships" xmlns:v="urn:schemas-microsoft-com:vml" xmlns:w10="urn:schemas-microsoft-com:office:word" xmlns:w14="http://schemas.microsoft.com/office/word/2010/wordml" xmlns:w="http://schemas.openxmlformats.org/wordprocessingml/2006/main" xmlns:wne="http://schemas.microsoft.com/office/word/2006/wordml" xmlns:wp14="http://schemas.microsoft.com/office/word/2010/wordprocessingDrawing" xmlns:wp="http://schemas.openxmlformats.org/drawingml/2006/wordprocessingDrawing" xmlns:wpc="http://schemas.microsoft.com/office/word/2010/wordprocessingCanvas" xmlns:wpg="http://schemas.microsoft.com/office/word/2010/wordprocessingGroup" xmlns:wpi="http://schemas.microsoft.com/office/word/2010/wordprocessingInk" xmlns:wps="http://schemas.microsoft.com/office/word/2010/wordprocessingShape" mc:Ignorable="w14 wp14">
   <w:p>
     <w:pPr>
-      <w:pStyle w:val="Footer"/>
       <w:tabs>
         <w:tab w:pos="13968" w:val="right"/>
       </w:tabs>
       <w:spacing w:before="60"/>
+      <w:jc w:val="left"/>
     </w:pPr>
     <w:r/>
     <w:r>
@@ -15290,11 +15290,11 @@
 <w:ftr xmlns:m="http://schemas.openxmlformats.org/officeDocument/2006/math" xmlns:mc="http://schemas.openxmlformats.org/markup-compatibility/2006" xmlns:mo="http://schemas.microsoft.com/office/mac/office/2008/main" xmlns:mv="urn:schemas-microsoft-com:mac:vml" xmlns:o="urn:schemas-microsoft-com:office:office" xmlns:r="http://schemas.openxmlformats.org/officeDocument/2006/relationships" xmlns:v="urn:schemas-microsoft-com:vml" xmlns:w10="urn:schemas-microsoft-com:office:word" xmlns:w14="http://schemas.microsoft.com/office/word/2010/wordml" xmlns:w="http://schemas.openxmlformats.org/wordprocessingml/2006/main" xmlns:wne="http://schemas.microsoft.com/office/word/2006/wordml" xmlns:wp14="http://schemas.microsoft.com/office/word/2010/wordprocessingDrawing" xmlns:wp="http://schemas.openxmlformats.org/drawingml/2006/wordprocessingDrawing" xmlns:wpc="http://schemas.microsoft.com/office/word/2010/wordprocessingCanvas" xmlns:wpg="http://schemas.microsoft.com/office/word/2010/wordprocessingGroup" xmlns:wpi="http://schemas.microsoft.com/office/word/2010/wordprocessingInk" xmlns:wps="http://schemas.microsoft.com/office/word/2010/wordprocessingShape" mc:Ignorable="w14 wp14">
   <w:p>
     <w:pPr>
-      <w:pStyle w:val="Footer"/>
       <w:tabs>
         <w:tab w:pos="9360" w:val="right"/>
       </w:tabs>
       <w:spacing w:before="60"/>
+      <w:jc w:val="left"/>
     </w:pPr>
     <w:r/>
     <w:r>
@@ -15336,11 +15336,11 @@
 <w:ftr xmlns:m="http://schemas.openxmlformats.org/officeDocument/2006/math" xmlns:mc="http://schemas.openxmlformats.org/markup-compatibility/2006" xmlns:mo="http://schemas.microsoft.com/office/mac/office/2008/main" xmlns:mv="urn:schemas-microsoft-com:mac:vml" xmlns:o="urn:schemas-microsoft-com:office:office" xmlns:r="http://schemas.openxmlformats.org/officeDocument/2006/relationships" xmlns:v="urn:schemas-microsoft-com:vml" xmlns:w10="urn:schemas-microsoft-com:office:word" xmlns:w14="http://schemas.microsoft.com/office/word/2010/wordml" xmlns:w="http://schemas.openxmlformats.org/wordprocessingml/2006/main" xmlns:wne="http://schemas.microsoft.com/office/word/2006/wordml" xmlns:wp14="http://schemas.microsoft.com/office/word/2010/wordprocessingDrawing" xmlns:wp="http://schemas.openxmlformats.org/drawingml/2006/wordprocessingDrawing" xmlns:wpc="http://schemas.microsoft.com/office/word/2010/wordprocessingCanvas" xmlns:wpg="http://schemas.microsoft.com/office/word/2010/wordprocessingGroup" xmlns:wpi="http://schemas.microsoft.com/office/word/2010/wordprocessingInk" xmlns:wps="http://schemas.microsoft.com/office/word/2010/wordprocessingShape" mc:Ignorable="w14 wp14">
   <w:p>
     <w:pPr>
-      <w:pStyle w:val="Footer"/>
       <w:tabs>
         <w:tab w:pos="13968" w:val="right"/>
       </w:tabs>
       <w:spacing w:before="60"/>
+      <w:jc w:val="left"/>
     </w:pPr>
     <w:r/>
     <w:r>
@@ -15382,11 +15382,11 @@
 <w:ftr xmlns:m="http://schemas.openxmlformats.org/officeDocument/2006/math" xmlns:mc="http://schemas.openxmlformats.org/markup-compatibility/2006" xmlns:mo="http://schemas.microsoft.com/office/mac/office/2008/main" xmlns:mv="urn:schemas-microsoft-com:mac:vml" xmlns:o="urn:schemas-microsoft-com:office:office" xmlns:r="http://schemas.openxmlformats.org/officeDocument/2006/relationships" xmlns:v="urn:schemas-microsoft-com:vml" xmlns:w10="urn:schemas-microsoft-com:office:word" xmlns:w14="http://schemas.microsoft.com/office/word/2010/wordml" xmlns:w="http://schemas.openxmlformats.org/wordprocessingml/2006/main" xmlns:wne="http://schemas.microsoft.com/office/word/2006/wordml" xmlns:wp14="http://schemas.microsoft.com/office/word/2010/wordprocessingDrawing" xmlns:wp="http://schemas.openxmlformats.org/drawingml/2006/wordprocessingDrawing" xmlns:wpc="http://schemas.microsoft.com/office/word/2010/wordprocessingCanvas" xmlns:wpg="http://schemas.microsoft.com/office/word/2010/wordprocessingGroup" xmlns:wpi="http://schemas.microsoft.com/office/word/2010/wordprocessingInk" xmlns:wps="http://schemas.microsoft.com/office/word/2010/wordprocessingShape" mc:Ignorable="w14 wp14">
   <w:p>
     <w:pPr>
-      <w:pStyle w:val="Footer"/>
       <w:tabs>
         <w:tab w:pos="9360" w:val="right"/>
       </w:tabs>
       <w:spacing w:before="60"/>
+      <w:jc w:val="left"/>
     </w:pPr>
     <w:r/>
     <w:r>
@@ -15428,11 +15428,11 @@
 <w:ftr xmlns:m="http://schemas.openxmlformats.org/officeDocument/2006/math" xmlns:mc="http://schemas.openxmlformats.org/markup-compatibility/2006" xmlns:mo="http://schemas.microsoft.com/office/mac/office/2008/main" xmlns:mv="urn:schemas-microsoft-com:mac:vml" xmlns:o="urn:schemas-microsoft-com:office:office" xmlns:r="http://schemas.openxmlformats.org/officeDocument/2006/relationships" xmlns:v="urn:schemas-microsoft-com:vml" xmlns:w10="urn:schemas-microsoft-com:office:word" xmlns:w14="http://schemas.microsoft.com/office/word/2010/wordml" xmlns:w="http://schemas.openxmlformats.org/wordprocessingml/2006/main" xmlns:wne="http://schemas.microsoft.com/office/word/2006/wordml" xmlns:wp14="http://schemas.microsoft.com/office/word/2010/wordprocessingDrawing" xmlns:wp="http://schemas.openxmlformats.org/drawingml/2006/wordprocessingDrawing" xmlns:wpc="http://schemas.microsoft.com/office/word/2010/wordprocessingCanvas" xmlns:wpg="http://schemas.microsoft.com/office/word/2010/wordprocessingGroup" xmlns:wpi="http://schemas.microsoft.com/office/word/2010/wordprocessingInk" xmlns:wps="http://schemas.microsoft.com/office/word/2010/wordprocessingShape" mc:Ignorable="w14 wp14">
   <w:p>
     <w:pPr>
-      <w:pStyle w:val="Footer"/>
       <w:tabs>
         <w:tab w:pos="13968" w:val="right"/>
       </w:tabs>
       <w:spacing w:before="60"/>
+      <w:jc w:val="left"/>
     </w:pPr>
     <w:r/>
     <w:r>
@@ -15474,11 +15474,11 @@
 <w:ftr xmlns:m="http://schemas.openxmlformats.org/officeDocument/2006/math" xmlns:mc="http://schemas.openxmlformats.org/markup-compatibility/2006" xmlns:mo="http://schemas.microsoft.com/office/mac/office/2008/main" xmlns:mv="urn:schemas-microsoft-com:mac:vml" xmlns:o="urn:schemas-microsoft-com:office:office" xmlns:r="http://schemas.openxmlformats.org/officeDocument/2006/relationships" xmlns:v="urn:schemas-microsoft-com:vml" xmlns:w10="urn:schemas-microsoft-com:office:word" xmlns:w14="http://schemas.microsoft.com/office/word/2010/wordml" xmlns:w="http://schemas.openxmlformats.org/wordprocessingml/2006/main" xmlns:wne="http://schemas.microsoft.com/office/word/2006/wordml" xmlns:wp14="http://schemas.microsoft.com/office/word/2010/wordprocessingDrawing" xmlns:wp="http://schemas.openxmlformats.org/drawingml/2006/wordprocessingDrawing" xmlns:wpc="http://schemas.microsoft.com/office/word/2010/wordprocessingCanvas" xmlns:wpg="http://schemas.microsoft.com/office/word/2010/wordprocessingGroup" xmlns:wpi="http://schemas.microsoft.com/office/word/2010/wordprocessingInk" xmlns:wps="http://schemas.microsoft.com/office/word/2010/wordprocessingShape" mc:Ignorable="w14 wp14">
   <w:p>
     <w:pPr>
-      <w:pStyle w:val="Footer"/>
       <w:tabs>
         <w:tab w:pos="9360" w:val="right"/>
       </w:tabs>
       <w:spacing w:before="60"/>
+      <w:jc w:val="left"/>
     </w:pPr>
     <w:r/>
     <w:r>
@@ -15520,11 +15520,11 @@
 <w:hdr xmlns:m="http://schemas.openxmlformats.org/officeDocument/2006/math" xmlns:mc="http://schemas.openxmlformats.org/markup-compatibility/2006" xmlns:mo="http://schemas.microsoft.com/office/mac/office/2008/main" xmlns:mv="urn:schemas-microsoft-com:mac:vml" xmlns:o="urn:schemas-microsoft-com:office:office" xmlns:r="http://schemas.openxmlformats.org/officeDocument/2006/relationships" xmlns:v="urn:schemas-microsoft-com:vml" xmlns:w10="urn:schemas-microsoft-com:office:word" xmlns:w14="http://schemas.microsoft.com/office/word/2010/wordml" xmlns:w="http://schemas.openxmlformats.org/wordprocessingml/2006/main" xmlns:wne="http://schemas.microsoft.com/office/word/2006/wordml" xmlns:wp14="http://schemas.microsoft.com/office/word/2010/wordprocessingDrawing" xmlns:wp="http://schemas.openxmlformats.org/drawingml/2006/wordprocessingDrawing" xmlns:wpc="http://schemas.microsoft.com/office/word/2010/wordprocessingCanvas" xmlns:wpg="http://schemas.microsoft.com/office/word/2010/wordprocessingGroup" xmlns:wpi="http://schemas.microsoft.com/office/word/2010/wordprocessingInk" xmlns:wps="http://schemas.microsoft.com/office/word/2010/wordprocessingShape" mc:Ignorable="w14 wp14">
   <w:p>
     <w:pPr>
-      <w:pStyle w:val="Header"/>
       <w:tabs>
         <w:tab w:pos="9360" w:val="right"/>
       </w:tabs>
       <w:spacing w:after="60"/>
+      <w:jc w:val="left"/>
       <w:pBdr>
         <w:bottom w:val="single" w:sz="5" w:space="4" w:color="CBD5E1"/>
       </w:pBdr>
@@ -15558,11 +15558,11 @@
 <w:hdr xmlns:m="http://schemas.openxmlformats.org/officeDocument/2006/math" xmlns:mc="http://schemas.openxmlformats.org/markup-compatibility/2006" xmlns:mo="http://schemas.microsoft.com/office/mac/office/2008/main" xmlns:mv="urn:schemas-microsoft-com:mac:vml" xmlns:o="urn:schemas-microsoft-com:office:office" xmlns:r="http://schemas.openxmlformats.org/officeDocument/2006/relationships" xmlns:v="urn:schemas-microsoft-com:vml" xmlns:w10="urn:schemas-microsoft-com:office:word" xmlns:w14="http://schemas.microsoft.com/office/word/2010/wordml" xmlns:w="http://schemas.openxmlformats.org/wordprocessingml/2006/main" xmlns:wne="http://schemas.microsoft.com/office/word/2006/wordml" xmlns:wp14="http://schemas.microsoft.com/office/word/2010/wordprocessingDrawing" xmlns:wp="http://schemas.openxmlformats.org/drawingml/2006/wordprocessingDrawing" xmlns:wpc="http://schemas.microsoft.com/office/word/2010/wordprocessingCanvas" xmlns:wpg="http://schemas.microsoft.com/office/word/2010/wordprocessingGroup" xmlns:wpi="http://schemas.microsoft.com/office/word/2010/wordprocessingInk" xmlns:wps="http://schemas.microsoft.com/office/word/2010/wordprocessingShape" mc:Ignorable="w14 wp14">
   <w:p>
     <w:pPr>
-      <w:pStyle w:val="Header"/>
       <w:tabs>
         <w:tab w:pos="13968" w:val="right"/>
       </w:tabs>
       <w:spacing w:after="60"/>
+      <w:jc w:val="left"/>
       <w:pBdr>
         <w:bottom w:val="single" w:sz="5" w:space="4" w:color="CBD5E1"/>
       </w:pBdr>
@@ -15596,11 +15596,11 @@
 <w:hdr xmlns:m="http://schemas.openxmlformats.org/officeDocument/2006/math" xmlns:mc="http://schemas.openxmlformats.org/markup-compatibility/2006" xmlns:mo="http://schemas.microsoft.com/office/mac/office/2008/main" xmlns:mv="urn:schemas-microsoft-com:mac:vml" xmlns:o="urn:schemas-microsoft-com:office:office" xmlns:r="http://schemas.openxmlformats.org/officeDocument/2006/relationships" xmlns:v="urn:schemas-microsoft-com:vml" xmlns:w10="urn:schemas-microsoft-com:office:word" xmlns:w14="http://schemas.microsoft.com/office/word/2010/wordml" xmlns:w="http://schemas.openxmlformats.org/wordprocessingml/2006/main" xmlns:wne="http://schemas.microsoft.com/office/word/2006/wordml" xmlns:wp14="http://schemas.microsoft.com/office/word/2010/wordprocessingDrawing" xmlns:wp="http://schemas.openxmlformats.org/drawingml/2006/wordprocessingDrawing" xmlns:wpc="http://schemas.microsoft.com/office/word/2010/wordprocessingCanvas" xmlns:wpg="http://schemas.microsoft.com/office/word/2010/wordprocessingGroup" xmlns:wpi="http://schemas.microsoft.com/office/word/2010/wordprocessingInk" xmlns:wps="http://schemas.microsoft.com/office/word/2010/wordprocessingShape" mc:Ignorable="w14 wp14">
   <w:p>
     <w:pPr>
-      <w:pStyle w:val="Header"/>
       <w:tabs>
         <w:tab w:pos="9360" w:val="right"/>
       </w:tabs>
       <w:spacing w:after="60"/>
+      <w:jc w:val="left"/>
       <w:pBdr>
         <w:bottom w:val="single" w:sz="5" w:space="4" w:color="CBD5E1"/>
       </w:pBdr>
@@ -15634,11 +15634,11 @@
 <w:hdr xmlns:m="http://schemas.openxmlformats.org/officeDocument/2006/math" xmlns:mc="http://schemas.openxmlformats.org/markup-compatibility/2006" xmlns:mo="http://schemas.microsoft.com/office/mac/office/2008/main" xmlns:mv="urn:schemas-microsoft-com:mac:vml" xmlns:o="urn:schemas-microsoft-com:office:office" xmlns:r="http://schemas.openxmlformats.org/officeDocument/2006/relationships" xmlns:v="urn:schemas-microsoft-com:vml" xmlns:w10="urn:schemas-microsoft-com:office:word" xmlns:w14="http://schemas.microsoft.com/office/word/2010/wordml" xmlns:w="http://schemas.openxmlformats.org/wordprocessingml/2006/main" xmlns:wne="http://schemas.microsoft.com/office/word/2006/wordml" xmlns:wp14="http://schemas.microsoft.com/office/word/2010/wordprocessingDrawing" xmlns:wp="http://schemas.openxmlformats.org/drawingml/2006/wordprocessingDrawing" xmlns:wpc="http://schemas.microsoft.com/office/word/2010/wordprocessingCanvas" xmlns:wpg="http://schemas.microsoft.com/office/word/2010/wordprocessingGroup" xmlns:wpi="http://schemas.microsoft.com/office/word/2010/wordprocessingInk" xmlns:wps="http://schemas.microsoft.com/office/word/2010/wordprocessingShape" mc:Ignorable="w14 wp14">
   <w:p>
     <w:pPr>
-      <w:pStyle w:val="Header"/>
       <w:tabs>
         <w:tab w:pos="13968" w:val="right"/>
       </w:tabs>
       <w:spacing w:after="60"/>
+      <w:jc w:val="left"/>
       <w:pBdr>
         <w:bottom w:val="single" w:sz="5" w:space="4" w:color="CBD5E1"/>
       </w:pBdr>
@@ -15672,11 +15672,11 @@
 <w:hdr xmlns:m="http://schemas.openxmlformats.org/officeDocument/2006/math" xmlns:mc="http://schemas.openxmlformats.org/markup-compatibility/2006" xmlns:mo="http://schemas.microsoft.com/office/mac/office/2008/main" xmlns:mv="urn:schemas-microsoft-com:mac:vml" xmlns:o="urn:schemas-microsoft-com:office:office" xmlns:r="http://schemas.openxmlformats.org/officeDocument/2006/relationships" xmlns:v="urn:schemas-microsoft-com:vml" xmlns:w10="urn:schemas-microsoft-com:office:word" xmlns:w14="http://schemas.microsoft.com/office/word/2010/wordml" xmlns:w="http://schemas.openxmlformats.org/wordprocessingml/2006/main" xmlns:wne="http://schemas.microsoft.com/office/word/2006/wordml" xmlns:wp14="http://schemas.microsoft.com/office/word/2010/wordprocessingDrawing" xmlns:wp="http://schemas.openxmlformats.org/drawingml/2006/wordprocessingDrawing" xmlns:wpc="http://schemas.microsoft.com/office/word/2010/wordprocessingCanvas" xmlns:wpg="http://schemas.microsoft.com/office/word/2010/wordprocessingGroup" xmlns:wpi="http://schemas.microsoft.com/office/word/2010/wordprocessingInk" xmlns:wps="http://schemas.microsoft.com/office/word/2010/wordprocessingShape" mc:Ignorable="w14 wp14">
   <w:p>
     <w:pPr>
-      <w:pStyle w:val="Header"/>
       <w:tabs>
         <w:tab w:pos="9360" w:val="right"/>
       </w:tabs>
       <w:spacing w:after="60"/>
+      <w:jc w:val="left"/>
       <w:pBdr>
         <w:bottom w:val="single" w:sz="5" w:space="4" w:color="CBD5E1"/>
       </w:pBdr>
@@ -15710,11 +15710,11 @@
 <w:hdr xmlns:m="http://schemas.openxmlformats.org/officeDocument/2006/math" xmlns:mc="http://schemas.openxmlformats.org/markup-compatibility/2006" xmlns:mo="http://schemas.microsoft.com/office/mac/office/2008/main" xmlns:mv="urn:schemas-microsoft-com:mac:vml" xmlns:o="urn:schemas-microsoft-com:office:office" xmlns:r="http://schemas.openxmlformats.org/officeDocument/2006/relationships" xmlns:v="urn:schemas-microsoft-com:vml" xmlns:w10="urn:schemas-microsoft-com:office:word" xmlns:w14="http://schemas.microsoft.com/office/word/2010/wordml" xmlns:w="http://schemas.openxmlformats.org/wordprocessingml/2006/main" xmlns:wne="http://schemas.microsoft.com/office/word/2006/wordml" xmlns:wp14="http://schemas.microsoft.com/office/word/2010/wordprocessingDrawing" xmlns:wp="http://schemas.openxmlformats.org/drawingml/2006/wordprocessingDrawing" xmlns:wpc="http://schemas.microsoft.com/office/word/2010/wordprocessingCanvas" xmlns:wpg="http://schemas.microsoft.com/office/word/2010/wordprocessingGroup" xmlns:wpi="http://schemas.microsoft.com/office/word/2010/wordprocessingInk" xmlns:wps="http://schemas.microsoft.com/office/word/2010/wordprocessingShape" mc:Ignorable="w14 wp14">
   <w:p>
     <w:pPr>
-      <w:pStyle w:val="Header"/>
       <w:tabs>
         <w:tab w:pos="13968" w:val="right"/>
       </w:tabs>
       <w:spacing w:after="60"/>
+      <w:jc w:val="left"/>
       <w:pBdr>
         <w:bottom w:val="single" w:sz="5" w:space="4" w:color="CBD5E1"/>
       </w:pBdr>
@@ -15748,11 +15748,11 @@
 <w:hdr xmlns:m="http://schemas.openxmlformats.org/officeDocument/2006/math" xmlns:mc="http://schemas.openxmlformats.org/markup-compatibility/2006" xmlns:mo="http://schemas.microsoft.com/office/mac/office/2008/main" xmlns:mv="urn:schemas-microsoft-com:mac:vml" xmlns:o="urn:schemas-microsoft-com:office:office" xmlns:r="http://schemas.openxmlformats.org/officeDocument/2006/relationships" xmlns:v="urn:schemas-microsoft-com:vml" xmlns:w10="urn:schemas-microsoft-com:office:word" xmlns:w14="http://schemas.microsoft.com/office/word/2010/wordml" xmlns:w="http://schemas.openxmlformats.org/wordprocessingml/2006/main" xmlns:wne="http://schemas.microsoft.com/office/word/2006/wordml" xmlns:wp14="http://schemas.microsoft.com/office/word/2010/wordprocessingDrawing" xmlns:wp="http://schemas.openxmlformats.org/drawingml/2006/wordprocessingDrawing" xmlns:wpc="http://schemas.microsoft.com/office/word/2010/wordprocessingCanvas" xmlns:wpg="http://schemas.microsoft.com/office/word/2010/wordprocessingGroup" xmlns:wpi="http://schemas.microsoft.com/office/word/2010/wordprocessingInk" xmlns:wps="http://schemas.microsoft.com/office/word/2010/wordprocessingShape" mc:Ignorable="w14 wp14">
   <w:p>
     <w:pPr>
-      <w:pStyle w:val="Header"/>
       <w:tabs>
         <w:tab w:pos="9360" w:val="right"/>
       </w:tabs>
       <w:spacing w:after="60"/>
+      <w:jc w:val="left"/>
       <w:pBdr>
         <w:bottom w:val="single" w:sz="5" w:space="4" w:color="CBD5E1"/>
       </w:pBdr>
@@ -15786,11 +15786,11 @@
 <w:hdr xmlns:m="http://schemas.openxmlformats.org/officeDocument/2006/math" xmlns:mc="http://schemas.openxmlformats.org/markup-compatibility/2006" xmlns:mo="http://schemas.microsoft.com/office/mac/office/2008/main" xmlns:mv="urn:schemas-microsoft-com:mac:vml" xmlns:o="urn:schemas-microsoft-com:office:office" xmlns:r="http://schemas.openxmlformats.org/officeDocument/2006/relationships" xmlns:v="urn:schemas-microsoft-com:vml" xmlns:w10="urn:schemas-microsoft-com:office:word" xmlns:w14="http://schemas.microsoft.com/office/word/2010/wordml" xmlns:w="http://schemas.openxmlformats.org/wordprocessingml/2006/main" xmlns:wne="http://schemas.microsoft.com/office/word/2006/wordml" xmlns:wp14="http://schemas.microsoft.com/office/word/2010/wordprocessingDrawing" xmlns:wp="http://schemas.openxmlformats.org/drawingml/2006/wordprocessingDrawing" xmlns:wpc="http://schemas.microsoft.com/office/word/2010/wordprocessingCanvas" xmlns:wpg="http://schemas.microsoft.com/office/word/2010/wordprocessingGroup" xmlns:wpi="http://schemas.microsoft.com/office/word/2010/wordprocessingInk" xmlns:wps="http://schemas.microsoft.com/office/word/2010/wordprocessingShape" mc:Ignorable="w14 wp14">
   <w:p>
     <w:pPr>
-      <w:pStyle w:val="Header"/>
       <w:tabs>
         <w:tab w:pos="13968" w:val="right"/>
       </w:tabs>
       <w:spacing w:after="60"/>
+      <w:jc w:val="left"/>
       <w:pBdr>
         <w:bottom w:val="single" w:sz="5" w:space="4" w:color="CBD5E1"/>
       </w:pBdr>
@@ -15824,11 +15824,11 @@
 <w:hdr xmlns:m="http://schemas.openxmlformats.org/officeDocument/2006/math" xmlns:mc="http://schemas.openxmlformats.org/markup-compatibility/2006" xmlns:mo="http://schemas.microsoft.com/office/mac/office/2008/main" xmlns:mv="urn:schemas-microsoft-com:mac:vml" xmlns:o="urn:schemas-microsoft-com:office:office" xmlns:r="http://schemas.openxmlformats.org/officeDocument/2006/relationships" xmlns:v="urn:schemas-microsoft-com:vml" xmlns:w10="urn:schemas-microsoft-com:office:word" xmlns:w14="http://schemas.microsoft.com/office/word/2010/wordml" xmlns:w="http://schemas.openxmlformats.org/wordprocessingml/2006/main" xmlns:wne="http://schemas.microsoft.com/office/word/2006/wordml" xmlns:wp14="http://schemas.microsoft.com/office/word/2010/wordprocessingDrawing" xmlns:wp="http://schemas.openxmlformats.org/drawingml/2006/wordprocessingDrawing" xmlns:wpc="http://schemas.microsoft.com/office/word/2010/wordprocessingCanvas" xmlns:wpg="http://schemas.microsoft.com/office/word/2010/wordprocessingGroup" xmlns:wpi="http://schemas.microsoft.com/office/word/2010/wordprocessingInk" xmlns:wps="http://schemas.microsoft.com/office/word/2010/wordprocessingShape" mc:Ignorable="w14 wp14">
   <w:p>
     <w:pPr>
-      <w:pStyle w:val="Header"/>
       <w:tabs>
         <w:tab w:pos="9360" w:val="right"/>
       </w:tabs>
       <w:spacing w:after="60"/>
+      <w:jc w:val="left"/>
       <w:pBdr>
         <w:bottom w:val="single" w:sz="5" w:space="4" w:color="CBD5E1"/>
       </w:pBdr>
@@ -15862,11 +15862,11 @@
 <w:hdr xmlns:m="http://schemas.openxmlformats.org/officeDocument/2006/math" xmlns:mc="http://schemas.openxmlformats.org/markup-compatibility/2006" xmlns:mo="http://schemas.microsoft.com/office/mac/office/2008/main" xmlns:mv="urn:schemas-microsoft-com:mac:vml" xmlns:o="urn:schemas-microsoft-com:office:office" xmlns:r="http://schemas.openxmlformats.org/officeDocument/2006/relationships" xmlns:v="urn:schemas-microsoft-com:vml" xmlns:w10="urn:schemas-microsoft-com:office:word" xmlns:w14="http://schemas.microsoft.com/office/word/2010/wordml" xmlns:w="http://schemas.openxmlformats.org/wordprocessingml/2006/main" xmlns:wne="http://schemas.microsoft.com/office/word/2006/wordml" xmlns:wp14="http://schemas.microsoft.com/office/word/2010/wordprocessingDrawing" xmlns:wp="http://schemas.openxmlformats.org/drawingml/2006/wordprocessingDrawing" xmlns:wpc="http://schemas.microsoft.com/office/word/2010/wordprocessingCanvas" xmlns:wpg="http://schemas.microsoft.com/office/word/2010/wordprocessingGroup" xmlns:wpi="http://schemas.microsoft.com/office/word/2010/wordprocessingInk" xmlns:wps="http://schemas.microsoft.com/office/word/2010/wordprocessingShape" mc:Ignorable="w14 wp14">
   <w:p>
     <w:pPr>
-      <w:pStyle w:val="Header"/>
       <w:tabs>
         <w:tab w:pos="13968" w:val="right"/>
       </w:tabs>
       <w:spacing w:after="60"/>
+      <w:jc w:val="left"/>
       <w:pBdr>
         <w:bottom w:val="single" w:sz="5" w:space="4" w:color="CBD5E1"/>
       </w:pBdr>
@@ -15900,11 +15900,11 @@
 <w:hdr xmlns:m="http://schemas.openxmlformats.org/officeDocument/2006/math" xmlns:mc="http://schemas.openxmlformats.org/markup-compatibility/2006" xmlns:mo="http://schemas.microsoft.com/office/mac/office/2008/main" xmlns:mv="urn:schemas-microsoft-com:mac:vml" xmlns:o="urn:schemas-microsoft-com:office:office" xmlns:r="http://schemas.openxmlformats.org/officeDocument/2006/relationships" xmlns:v="urn:schemas-microsoft-com:vml" xmlns:w10="urn:schemas-microsoft-com:office:word" xmlns:w14="http://schemas.microsoft.com/office/word/2010/wordml" xmlns:w="http://schemas.openxmlformats.org/wordprocessingml/2006/main" xmlns:wne="http://schemas.microsoft.com/office/word/2006/wordml" xmlns:wp14="http://schemas.microsoft.com/office/word/2010/wordprocessingDrawing" xmlns:wp="http://schemas.openxmlformats.org/drawingml/2006/wordprocessingDrawing" xmlns:wpc="http://schemas.microsoft.com/office/word/2010/wordprocessingCanvas" xmlns:wpg="http://schemas.microsoft.com/office/word/2010/wordprocessingGroup" xmlns:wpi="http://schemas.microsoft.com/office/word/2010/wordprocessingInk" xmlns:wps="http://schemas.microsoft.com/office/word/2010/wordprocessingShape" mc:Ignorable="w14 wp14">
   <w:p>
     <w:pPr>
-      <w:pStyle w:val="Header"/>
       <w:tabs>
         <w:tab w:pos="9360" w:val="right"/>
       </w:tabs>
       <w:spacing w:after="60"/>
+      <w:jc w:val="left"/>
       <w:pBdr>
         <w:bottom w:val="single" w:sz="5" w:space="4" w:color="CBD5E1"/>
       </w:pBdr>
@@ -15938,11 +15938,11 @@
 <w:hdr xmlns:m="http://schemas.openxmlformats.org/officeDocument/2006/math" xmlns:mc="http://schemas.openxmlformats.org/markup-compatibility/2006" xmlns:mo="http://schemas.microsoft.com/office/mac/office/2008/main" xmlns:mv="urn:schemas-microsoft-com:mac:vml" xmlns:o="urn:schemas-microsoft-com:office:office" xmlns:r="http://schemas.openxmlformats.org/officeDocument/2006/relationships" xmlns:v="urn:schemas-microsoft-com:vml" xmlns:w10="urn:schemas-microsoft-com:office:word" xmlns:w14="http://schemas.microsoft.com/office/word/2010/wordml" xmlns:w="http://schemas.openxmlformats.org/wordprocessingml/2006/main" xmlns:wne="http://schemas.microsoft.com/office/word/2006/wordml" xmlns:wp14="http://schemas.microsoft.com/office/word/2010/wordprocessingDrawing" xmlns:wp="http://schemas.openxmlformats.org/drawingml/2006/wordprocessingDrawing" xmlns:wpc="http://schemas.microsoft.com/office/word/2010/wordprocessingCanvas" xmlns:wpg="http://schemas.microsoft.com/office/word/2010/wordprocessingGroup" xmlns:wpi="http://schemas.microsoft.com/office/word/2010/wordprocessingInk" xmlns:wps="http://schemas.microsoft.com/office/word/2010/wordprocessingShape" mc:Ignorable="w14 wp14">
   <w:p>
     <w:pPr>
-      <w:pStyle w:val="Header"/>
       <w:tabs>
         <w:tab w:pos="13968" w:val="right"/>
       </w:tabs>
       <w:spacing w:after="60"/>
+      <w:jc w:val="left"/>
       <w:pBdr>
         <w:bottom w:val="single" w:sz="5" w:space="4" w:color="CBD5E1"/>
       </w:pBdr>
@@ -15976,11 +15976,11 @@
 <w:hdr xmlns:m="http://schemas.openxmlformats.org/officeDocument/2006/math" xmlns:mc="http://schemas.openxmlformats.org/markup-compatibility/2006" xmlns:mo="http://schemas.microsoft.com/office/mac/office/2008/main" xmlns:mv="urn:schemas-microsoft-com:mac:vml" xmlns:o="urn:schemas-microsoft-com:office:office" xmlns:r="http://schemas.openxmlformats.org/officeDocument/2006/relationships" xmlns:v="urn:schemas-microsoft-com:vml" xmlns:w10="urn:schemas-microsoft-com:office:word" xmlns:w14="http://schemas.microsoft.com/office/word/2010/wordml" xmlns:w="http://schemas.openxmlformats.org/wordprocessingml/2006/main" xmlns:wne="http://schemas.microsoft.com/office/word/2006/wordml" xmlns:wp14="http://schemas.microsoft.com/office/word/2010/wordprocessingDrawing" xmlns:wp="http://schemas.openxmlformats.org/drawingml/2006/wordprocessingDrawing" xmlns:wpc="http://schemas.microsoft.com/office/word/2010/wordprocessingCanvas" xmlns:wpg="http://schemas.microsoft.com/office/word/2010/wordprocessingGroup" xmlns:wpi="http://schemas.microsoft.com/office/word/2010/wordprocessingInk" xmlns:wps="http://schemas.microsoft.com/office/word/2010/wordprocessingShape" mc:Ignorable="w14 wp14">
   <w:p>
     <w:pPr>
-      <w:pStyle w:val="Header"/>
       <w:tabs>
         <w:tab w:pos="9360" w:val="right"/>
       </w:tabs>
       <w:spacing w:after="60"/>
+      <w:jc w:val="left"/>
       <w:pBdr>
         <w:bottom w:val="single" w:sz="5" w:space="4" w:color="CBD5E1"/>
       </w:pBdr>
@@ -16014,11 +16014,11 @@
 <w:hdr xmlns:m="http://schemas.openxmlformats.org/officeDocument/2006/math" xmlns:mc="http://schemas.openxmlformats.org/markup-compatibility/2006" xmlns:mo="http://schemas.microsoft.com/office/mac/office/2008/main" xmlns:mv="urn:schemas-microsoft-com:mac:vml" xmlns:o="urn:schemas-microsoft-com:office:office" xmlns:r="http://schemas.openxmlformats.org/officeDocument/2006/relationships" xmlns:v="urn:schemas-microsoft-com:vml" xmlns:w10="urn:schemas-microsoft-com:office:word" xmlns:w14="http://schemas.microsoft.com/office/word/2010/wordml" xmlns:w="http://schemas.openxmlformats.org/wordprocessingml/2006/main" xmlns:wne="http://schemas.microsoft.com/office/word/2006/wordml" xmlns:wp14="http://schemas.microsoft.com/office/word/2010/wordprocessingDrawing" xmlns:wp="http://schemas.openxmlformats.org/drawingml/2006/wordprocessingDrawing" xmlns:wpc="http://schemas.microsoft.com/office/word/2010/wordprocessingCanvas" xmlns:wpg="http://schemas.microsoft.com/office/word/2010/wordprocessingGroup" xmlns:wpi="http://schemas.microsoft.com/office/word/2010/wordprocessingInk" xmlns:wps="http://schemas.microsoft.com/office/word/2010/wordprocessingShape" mc:Ignorable="w14 wp14">
   <w:p>
     <w:pPr>
-      <w:pStyle w:val="Header"/>
       <w:tabs>
         <w:tab w:pos="13968" w:val="right"/>
       </w:tabs>
       <w:spacing w:after="60"/>
+      <w:jc w:val="left"/>
       <w:pBdr>
         <w:bottom w:val="single" w:sz="5" w:space="4" w:color="CBD5E1"/>
       </w:pBdr>
@@ -16052,11 +16052,11 @@
 <w:hdr xmlns:m="http://schemas.openxmlformats.org/officeDocument/2006/math" xmlns:mc="http://schemas.openxmlformats.org/markup-compatibility/2006" xmlns:mo="http://schemas.microsoft.com/office/mac/office/2008/main" xmlns:mv="urn:schemas-microsoft-com:mac:vml" xmlns:o="urn:schemas-microsoft-com:office:office" xmlns:r="http://schemas.openxmlformats.org/officeDocument/2006/relationships" xmlns:v="urn:schemas-microsoft-com:vml" xmlns:w10="urn:schemas-microsoft-com:office:word" xmlns:w14="http://schemas.microsoft.com/office/word/2010/wordml" xmlns:w="http://schemas.openxmlformats.org/wordprocessingml/2006/main" xmlns:wne="http://schemas.microsoft.com/office/word/2006/wordml" xmlns:wp14="http://schemas.microsoft.com/office/word/2010/wordprocessingDrawing" xmlns:wp="http://schemas.openxmlformats.org/drawingml/2006/wordprocessingDrawing" xmlns:wpc="http://schemas.microsoft.com/office/word/2010/wordprocessingCanvas" xmlns:wpg="http://schemas.microsoft.com/office/word/2010/wordprocessingGroup" xmlns:wpi="http://schemas.microsoft.com/office/word/2010/wordprocessingInk" xmlns:wps="http://schemas.microsoft.com/office/word/2010/wordprocessingShape" mc:Ignorable="w14 wp14">
   <w:p>
     <w:pPr>
-      <w:pStyle w:val="Header"/>
       <w:tabs>
         <w:tab w:pos="9360" w:val="right"/>
       </w:tabs>
       <w:spacing w:after="60"/>
+      <w:jc w:val="left"/>
       <w:pBdr>
         <w:bottom w:val="single" w:sz="5" w:space="4" w:color="CBD5E1"/>
       </w:pBdr>
@@ -16090,11 +16090,11 @@
 <w:hdr xmlns:m="http://schemas.openxmlformats.org/officeDocument/2006/math" xmlns:mc="http://schemas.openxmlformats.org/markup-compatibility/2006" xmlns:mo="http://schemas.microsoft.com/office/mac/office/2008/main" xmlns:mv="urn:schemas-microsoft-com:mac:vml" xmlns:o="urn:schemas-microsoft-com:office:office" xmlns:r="http://schemas.openxmlformats.org/officeDocument/2006/relationships" xmlns:v="urn:schemas-microsoft-com:vml" xmlns:w10="urn:schemas-microsoft-com:office:word" xmlns:w14="http://schemas.microsoft.com/office/word/2010/wordml" xmlns:w="http://schemas.openxmlformats.org/wordprocessingml/2006/main" xmlns:wne="http://schemas.microsoft.com/office/word/2006/wordml" xmlns:wp14="http://schemas.microsoft.com/office/word/2010/wordprocessingDrawing" xmlns:wp="http://schemas.openxmlformats.org/drawingml/2006/wordprocessingDrawing" xmlns:wpc="http://schemas.microsoft.com/office/word/2010/wordprocessingCanvas" xmlns:wpg="http://schemas.microsoft.com/office/word/2010/wordprocessingGroup" xmlns:wpi="http://schemas.microsoft.com/office/word/2010/wordprocessingInk" xmlns:wps="http://schemas.microsoft.com/office/word/2010/wordprocessingShape" mc:Ignorable="w14 wp14">
   <w:p>
     <w:pPr>
-      <w:pStyle w:val="Header"/>
       <w:tabs>
         <w:tab w:pos="13968" w:val="right"/>
       </w:tabs>
       <w:spacing w:after="60"/>
+      <w:jc w:val="left"/>
       <w:pBdr>
         <w:bottom w:val="single" w:sz="5" w:space="4" w:color="CBD5E1"/>
       </w:pBdr>
@@ -16128,11 +16128,11 @@
 <w:hdr xmlns:m="http://schemas.openxmlformats.org/officeDocument/2006/math" xmlns:mc="http://schemas.openxmlformats.org/markup-compatibility/2006" xmlns:mo="http://schemas.microsoft.com/office/mac/office/2008/main" xmlns:mv="urn:schemas-microsoft-com:mac:vml" xmlns:o="urn:schemas-microsoft-com:office:office" xmlns:r="http://schemas.openxmlformats.org/officeDocument/2006/relationships" xmlns:v="urn:schemas-microsoft-com:vml" xmlns:w10="urn:schemas-microsoft-com:office:word" xmlns:w14="http://schemas.microsoft.com/office/word/2010/wordml" xmlns:w="http://schemas.openxmlformats.org/wordprocessingml/2006/main" xmlns:wne="http://schemas.microsoft.com/office/word/2006/wordml" xmlns:wp14="http://schemas.microsoft.com/office/word/2010/wordprocessingDrawing" xmlns:wp="http://schemas.openxmlformats.org/drawingml/2006/wordprocessingDrawing" xmlns:wpc="http://schemas.microsoft.com/office/word/2010/wordprocessingCanvas" xmlns:wpg="http://schemas.microsoft.com/office/word/2010/wordprocessingGroup" xmlns:wpi="http://schemas.microsoft.com/office/word/2010/wordprocessingInk" xmlns:wps="http://schemas.microsoft.com/office/word/2010/wordprocessingShape" mc:Ignorable="w14 wp14">
   <w:p>
     <w:pPr>
-      <w:pStyle w:val="Header"/>
       <w:tabs>
         <w:tab w:pos="9360" w:val="right"/>
       </w:tabs>
       <w:spacing w:after="60"/>
+      <w:jc w:val="left"/>
       <w:pBdr>
         <w:bottom w:val="single" w:sz="5" w:space="4" w:color="CBD5E1"/>
       </w:pBdr>

</xml_diff>